<commit_message>
move data to teaching repo
</commit_message>
<xml_diff>
--- a/Winter/EA_Syllabus_Kwartler_Winter_2025.docx
+++ b/Winter/EA_Syllabus_Kwartler_Winter_2025.docx
@@ -459,13 +459,741 @@
               <w:rPr>
                 <w:rFonts w:cs="Arial"/>
               </w:rPr>
-              <w:t>This module will take students beyond the basics of R programming and introduce them to more sophisticated techniques and tools for data analysis, modeling, and visualization. Students will learn how to apply their knowledge of analytics and data science to real-world business problems using R.</w:t>
-            </w:r>
-            <w:r>
-              <w:rPr>
-                <w:rFonts w:cs="Arial"/>
-              </w:rPr>
-              <w:t xml:space="preserve">  They will be able to then take these findings and articulate them in a manner that executives and non-technical people can understand.</w:t>
+              <w:t xml:space="preserve">This </w:t>
+            </w:r>
+            <w:proofErr w:type="spellStart"/>
+            <w:r>
+              <w:rPr>
+                <w:rFonts w:cs="Arial"/>
+              </w:rPr>
+              <w:t>module</w:t>
+            </w:r>
+            <w:proofErr w:type="spellEnd"/>
+            <w:r>
+              <w:rPr>
+                <w:rFonts w:cs="Arial"/>
+              </w:rPr>
+              <w:t xml:space="preserve"> will </w:t>
+            </w:r>
+            <w:proofErr w:type="spellStart"/>
+            <w:r>
+              <w:rPr>
+                <w:rFonts w:cs="Arial"/>
+              </w:rPr>
+              <w:t>take</w:t>
+            </w:r>
+            <w:proofErr w:type="spellEnd"/>
+            <w:r>
+              <w:rPr>
+                <w:rFonts w:cs="Arial"/>
+              </w:rPr>
+              <w:t xml:space="preserve"> </w:t>
+            </w:r>
+            <w:proofErr w:type="spellStart"/>
+            <w:r>
+              <w:rPr>
+                <w:rFonts w:cs="Arial"/>
+              </w:rPr>
+              <w:t>students</w:t>
+            </w:r>
+            <w:proofErr w:type="spellEnd"/>
+            <w:r>
+              <w:rPr>
+                <w:rFonts w:cs="Arial"/>
+              </w:rPr>
+              <w:t xml:space="preserve"> </w:t>
+            </w:r>
+            <w:proofErr w:type="spellStart"/>
+            <w:r>
+              <w:rPr>
+                <w:rFonts w:cs="Arial"/>
+              </w:rPr>
+              <w:t>beyond</w:t>
+            </w:r>
+            <w:proofErr w:type="spellEnd"/>
+            <w:r>
+              <w:rPr>
+                <w:rFonts w:cs="Arial"/>
+              </w:rPr>
+              <w:t xml:space="preserve"> </w:t>
+            </w:r>
+            <w:proofErr w:type="spellStart"/>
+            <w:r>
+              <w:rPr>
+                <w:rFonts w:cs="Arial"/>
+              </w:rPr>
+              <w:t>the</w:t>
+            </w:r>
+            <w:proofErr w:type="spellEnd"/>
+            <w:r>
+              <w:rPr>
+                <w:rFonts w:cs="Arial"/>
+              </w:rPr>
+              <w:t xml:space="preserve"> </w:t>
+            </w:r>
+            <w:proofErr w:type="spellStart"/>
+            <w:r>
+              <w:rPr>
+                <w:rFonts w:cs="Arial"/>
+              </w:rPr>
+              <w:t>basics</w:t>
+            </w:r>
+            <w:proofErr w:type="spellEnd"/>
+            <w:r>
+              <w:rPr>
+                <w:rFonts w:cs="Arial"/>
+              </w:rPr>
+              <w:t xml:space="preserve"> </w:t>
+            </w:r>
+            <w:proofErr w:type="spellStart"/>
+            <w:r>
+              <w:rPr>
+                <w:rFonts w:cs="Arial"/>
+              </w:rPr>
+              <w:t>of</w:t>
+            </w:r>
+            <w:proofErr w:type="spellEnd"/>
+            <w:r>
+              <w:rPr>
+                <w:rFonts w:cs="Arial"/>
+              </w:rPr>
+              <w:t xml:space="preserve"> R </w:t>
+            </w:r>
+            <w:proofErr w:type="spellStart"/>
+            <w:r>
+              <w:rPr>
+                <w:rFonts w:cs="Arial"/>
+              </w:rPr>
+              <w:t>programming</w:t>
+            </w:r>
+            <w:proofErr w:type="spellEnd"/>
+            <w:r>
+              <w:rPr>
+                <w:rFonts w:cs="Arial"/>
+              </w:rPr>
+              <w:t xml:space="preserve"> and </w:t>
+            </w:r>
+            <w:proofErr w:type="spellStart"/>
+            <w:r>
+              <w:rPr>
+                <w:rFonts w:cs="Arial"/>
+              </w:rPr>
+              <w:t>introduce</w:t>
+            </w:r>
+            <w:proofErr w:type="spellEnd"/>
+            <w:r>
+              <w:rPr>
+                <w:rFonts w:cs="Arial"/>
+              </w:rPr>
+              <w:t xml:space="preserve"> </w:t>
+            </w:r>
+            <w:proofErr w:type="spellStart"/>
+            <w:r>
+              <w:rPr>
+                <w:rFonts w:cs="Arial"/>
+              </w:rPr>
+              <w:t>them</w:t>
+            </w:r>
+            <w:proofErr w:type="spellEnd"/>
+            <w:r>
+              <w:rPr>
+                <w:rFonts w:cs="Arial"/>
+              </w:rPr>
+              <w:t xml:space="preserve"> </w:t>
+            </w:r>
+            <w:proofErr w:type="spellStart"/>
+            <w:r>
+              <w:rPr>
+                <w:rFonts w:cs="Arial"/>
+              </w:rPr>
+              <w:t>to</w:t>
+            </w:r>
+            <w:proofErr w:type="spellEnd"/>
+            <w:r>
+              <w:rPr>
+                <w:rFonts w:cs="Arial"/>
+              </w:rPr>
+              <w:t xml:space="preserve"> </w:t>
+            </w:r>
+            <w:proofErr w:type="spellStart"/>
+            <w:r>
+              <w:rPr>
+                <w:rFonts w:cs="Arial"/>
+              </w:rPr>
+              <w:t>more</w:t>
+            </w:r>
+            <w:proofErr w:type="spellEnd"/>
+            <w:r>
+              <w:rPr>
+                <w:rFonts w:cs="Arial"/>
+              </w:rPr>
+              <w:t xml:space="preserve"> sophisticated </w:t>
+            </w:r>
+            <w:proofErr w:type="spellStart"/>
+            <w:r>
+              <w:rPr>
+                <w:rFonts w:cs="Arial"/>
+              </w:rPr>
+              <w:t>techniques</w:t>
+            </w:r>
+            <w:proofErr w:type="spellEnd"/>
+            <w:r>
+              <w:rPr>
+                <w:rFonts w:cs="Arial"/>
+              </w:rPr>
+              <w:t xml:space="preserve"> and </w:t>
+            </w:r>
+            <w:proofErr w:type="spellStart"/>
+            <w:r>
+              <w:rPr>
+                <w:rFonts w:cs="Arial"/>
+              </w:rPr>
+              <w:t>tools</w:t>
+            </w:r>
+            <w:proofErr w:type="spellEnd"/>
+            <w:r>
+              <w:rPr>
+                <w:rFonts w:cs="Arial"/>
+              </w:rPr>
+              <w:t xml:space="preserve"> </w:t>
+            </w:r>
+            <w:proofErr w:type="spellStart"/>
+            <w:r>
+              <w:rPr>
+                <w:rFonts w:cs="Arial"/>
+              </w:rPr>
+              <w:t>for</w:t>
+            </w:r>
+            <w:proofErr w:type="spellEnd"/>
+            <w:r>
+              <w:rPr>
+                <w:rFonts w:cs="Arial"/>
+              </w:rPr>
+              <w:t xml:space="preserve"> </w:t>
+            </w:r>
+            <w:proofErr w:type="spellStart"/>
+            <w:r>
+              <w:rPr>
+                <w:rFonts w:cs="Arial"/>
+              </w:rPr>
+              <w:t>data</w:t>
+            </w:r>
+            <w:proofErr w:type="spellEnd"/>
+            <w:r>
+              <w:rPr>
+                <w:rFonts w:cs="Arial"/>
+              </w:rPr>
+              <w:t xml:space="preserve"> </w:t>
+            </w:r>
+            <w:proofErr w:type="spellStart"/>
+            <w:r>
+              <w:rPr>
+                <w:rFonts w:cs="Arial"/>
+              </w:rPr>
+              <w:t>analysis</w:t>
+            </w:r>
+            <w:proofErr w:type="spellEnd"/>
+            <w:r>
+              <w:rPr>
+                <w:rFonts w:cs="Arial"/>
+              </w:rPr>
+              <w:t xml:space="preserve">, </w:t>
+            </w:r>
+            <w:proofErr w:type="spellStart"/>
+            <w:r>
+              <w:rPr>
+                <w:rFonts w:cs="Arial"/>
+              </w:rPr>
+              <w:t>modeling</w:t>
+            </w:r>
+            <w:proofErr w:type="spellEnd"/>
+            <w:r>
+              <w:rPr>
+                <w:rFonts w:cs="Arial"/>
+              </w:rPr>
+              <w:t xml:space="preserve">, and </w:t>
+            </w:r>
+            <w:proofErr w:type="spellStart"/>
+            <w:r>
+              <w:rPr>
+                <w:rFonts w:cs="Arial"/>
+              </w:rPr>
+              <w:t>visualization</w:t>
+            </w:r>
+            <w:proofErr w:type="spellEnd"/>
+            <w:r>
+              <w:rPr>
+                <w:rFonts w:cs="Arial"/>
+              </w:rPr>
+              <w:t xml:space="preserve">. </w:t>
+            </w:r>
+            <w:proofErr w:type="spellStart"/>
+            <w:r>
+              <w:rPr>
+                <w:rFonts w:cs="Arial"/>
+              </w:rPr>
+              <w:t>Students</w:t>
+            </w:r>
+            <w:proofErr w:type="spellEnd"/>
+            <w:r>
+              <w:rPr>
+                <w:rFonts w:cs="Arial"/>
+              </w:rPr>
+              <w:t xml:space="preserve"> will </w:t>
+            </w:r>
+            <w:proofErr w:type="spellStart"/>
+            <w:r>
+              <w:rPr>
+                <w:rFonts w:cs="Arial"/>
+              </w:rPr>
+              <w:t>learn</w:t>
+            </w:r>
+            <w:proofErr w:type="spellEnd"/>
+            <w:r>
+              <w:rPr>
+                <w:rFonts w:cs="Arial"/>
+              </w:rPr>
+              <w:t xml:space="preserve"> </w:t>
+            </w:r>
+            <w:proofErr w:type="spellStart"/>
+            <w:r>
+              <w:rPr>
+                <w:rFonts w:cs="Arial"/>
+              </w:rPr>
+              <w:t>how</w:t>
+            </w:r>
+            <w:proofErr w:type="spellEnd"/>
+            <w:r>
+              <w:rPr>
+                <w:rFonts w:cs="Arial"/>
+              </w:rPr>
+              <w:t xml:space="preserve"> </w:t>
+            </w:r>
+            <w:proofErr w:type="spellStart"/>
+            <w:r>
+              <w:rPr>
+                <w:rFonts w:cs="Arial"/>
+              </w:rPr>
+              <w:t>to</w:t>
+            </w:r>
+            <w:proofErr w:type="spellEnd"/>
+            <w:r>
+              <w:rPr>
+                <w:rFonts w:cs="Arial"/>
+              </w:rPr>
+              <w:t xml:space="preserve"> </w:t>
+            </w:r>
+            <w:proofErr w:type="spellStart"/>
+            <w:r>
+              <w:rPr>
+                <w:rFonts w:cs="Arial"/>
+              </w:rPr>
+              <w:t>apply</w:t>
+            </w:r>
+            <w:proofErr w:type="spellEnd"/>
+            <w:r>
+              <w:rPr>
+                <w:rFonts w:cs="Arial"/>
+              </w:rPr>
+              <w:t xml:space="preserve"> </w:t>
+            </w:r>
+            <w:proofErr w:type="spellStart"/>
+            <w:r>
+              <w:rPr>
+                <w:rFonts w:cs="Arial"/>
+              </w:rPr>
+              <w:t>their</w:t>
+            </w:r>
+            <w:proofErr w:type="spellEnd"/>
+            <w:r>
+              <w:rPr>
+                <w:rFonts w:cs="Arial"/>
+              </w:rPr>
+              <w:t xml:space="preserve"> </w:t>
+            </w:r>
+            <w:proofErr w:type="spellStart"/>
+            <w:r>
+              <w:rPr>
+                <w:rFonts w:cs="Arial"/>
+              </w:rPr>
+              <w:t>knowledge</w:t>
+            </w:r>
+            <w:proofErr w:type="spellEnd"/>
+            <w:r>
+              <w:rPr>
+                <w:rFonts w:cs="Arial"/>
+              </w:rPr>
+              <w:t xml:space="preserve"> </w:t>
+            </w:r>
+            <w:proofErr w:type="spellStart"/>
+            <w:r>
+              <w:rPr>
+                <w:rFonts w:cs="Arial"/>
+              </w:rPr>
+              <w:t>of</w:t>
+            </w:r>
+            <w:proofErr w:type="spellEnd"/>
+            <w:r>
+              <w:rPr>
+                <w:rFonts w:cs="Arial"/>
+              </w:rPr>
+              <w:t xml:space="preserve"> </w:t>
+            </w:r>
+            <w:proofErr w:type="spellStart"/>
+            <w:r>
+              <w:rPr>
+                <w:rFonts w:cs="Arial"/>
+              </w:rPr>
+              <w:t>analytics</w:t>
+            </w:r>
+            <w:proofErr w:type="spellEnd"/>
+            <w:r>
+              <w:rPr>
+                <w:rFonts w:cs="Arial"/>
+              </w:rPr>
+              <w:t xml:space="preserve"> and </w:t>
+            </w:r>
+            <w:proofErr w:type="spellStart"/>
+            <w:r>
+              <w:rPr>
+                <w:rFonts w:cs="Arial"/>
+              </w:rPr>
+              <w:t>data</w:t>
+            </w:r>
+            <w:proofErr w:type="spellEnd"/>
+            <w:r>
+              <w:rPr>
+                <w:rFonts w:cs="Arial"/>
+              </w:rPr>
+              <w:t xml:space="preserve"> </w:t>
+            </w:r>
+            <w:proofErr w:type="spellStart"/>
+            <w:r>
+              <w:rPr>
+                <w:rFonts w:cs="Arial"/>
+              </w:rPr>
+              <w:t>science</w:t>
+            </w:r>
+            <w:proofErr w:type="spellEnd"/>
+            <w:r>
+              <w:rPr>
+                <w:rFonts w:cs="Arial"/>
+              </w:rPr>
+              <w:t xml:space="preserve"> </w:t>
+            </w:r>
+            <w:proofErr w:type="spellStart"/>
+            <w:r>
+              <w:rPr>
+                <w:rFonts w:cs="Arial"/>
+              </w:rPr>
+              <w:t>to</w:t>
+            </w:r>
+            <w:proofErr w:type="spellEnd"/>
+            <w:r>
+              <w:rPr>
+                <w:rFonts w:cs="Arial"/>
+              </w:rPr>
+              <w:t xml:space="preserve"> real-</w:t>
+            </w:r>
+            <w:proofErr w:type="spellStart"/>
+            <w:r>
+              <w:rPr>
+                <w:rFonts w:cs="Arial"/>
+              </w:rPr>
+              <w:t>world</w:t>
+            </w:r>
+            <w:proofErr w:type="spellEnd"/>
+            <w:r>
+              <w:rPr>
+                <w:rFonts w:cs="Arial"/>
+              </w:rPr>
+              <w:t xml:space="preserve"> </w:t>
+            </w:r>
+            <w:proofErr w:type="spellStart"/>
+            <w:r>
+              <w:rPr>
+                <w:rFonts w:cs="Arial"/>
+              </w:rPr>
+              <w:t>business</w:t>
+            </w:r>
+            <w:proofErr w:type="spellEnd"/>
+            <w:r>
+              <w:rPr>
+                <w:rFonts w:cs="Arial"/>
+              </w:rPr>
+              <w:t xml:space="preserve"> </w:t>
+            </w:r>
+            <w:proofErr w:type="spellStart"/>
+            <w:r>
+              <w:rPr>
+                <w:rFonts w:cs="Arial"/>
+              </w:rPr>
+              <w:t>problems</w:t>
+            </w:r>
+            <w:proofErr w:type="spellEnd"/>
+            <w:r>
+              <w:rPr>
+                <w:rFonts w:cs="Arial"/>
+              </w:rPr>
+              <w:t xml:space="preserve"> </w:t>
+            </w:r>
+            <w:proofErr w:type="spellStart"/>
+            <w:r>
+              <w:rPr>
+                <w:rFonts w:cs="Arial"/>
+              </w:rPr>
+              <w:t>using</w:t>
+            </w:r>
+            <w:proofErr w:type="spellEnd"/>
+            <w:r>
+              <w:rPr>
+                <w:rFonts w:cs="Arial"/>
+              </w:rPr>
+              <w:t xml:space="preserve"> R.</w:t>
+            </w:r>
+            <w:r>
+              <w:rPr>
+                <w:rFonts w:cs="Arial"/>
+              </w:rPr>
+              <w:t xml:space="preserve">  </w:t>
+            </w:r>
+            <w:proofErr w:type="spellStart"/>
+            <w:r>
+              <w:rPr>
+                <w:rFonts w:cs="Arial"/>
+              </w:rPr>
+              <w:t>They</w:t>
+            </w:r>
+            <w:proofErr w:type="spellEnd"/>
+            <w:r>
+              <w:rPr>
+                <w:rFonts w:cs="Arial"/>
+              </w:rPr>
+              <w:t xml:space="preserve"> will </w:t>
+            </w:r>
+            <w:proofErr w:type="spellStart"/>
+            <w:r>
+              <w:rPr>
+                <w:rFonts w:cs="Arial"/>
+              </w:rPr>
+              <w:t>be</w:t>
+            </w:r>
+            <w:proofErr w:type="spellEnd"/>
+            <w:r>
+              <w:rPr>
+                <w:rFonts w:cs="Arial"/>
+              </w:rPr>
+              <w:t xml:space="preserve"> </w:t>
+            </w:r>
+            <w:proofErr w:type="spellStart"/>
+            <w:r>
+              <w:rPr>
+                <w:rFonts w:cs="Arial"/>
+              </w:rPr>
+              <w:t>able</w:t>
+            </w:r>
+            <w:proofErr w:type="spellEnd"/>
+            <w:r>
+              <w:rPr>
+                <w:rFonts w:cs="Arial"/>
+              </w:rPr>
+              <w:t xml:space="preserve"> </w:t>
+            </w:r>
+            <w:proofErr w:type="spellStart"/>
+            <w:r>
+              <w:rPr>
+                <w:rFonts w:cs="Arial"/>
+              </w:rPr>
+              <w:t>to</w:t>
+            </w:r>
+            <w:proofErr w:type="spellEnd"/>
+            <w:r>
+              <w:rPr>
+                <w:rFonts w:cs="Arial"/>
+              </w:rPr>
+              <w:t xml:space="preserve"> </w:t>
+            </w:r>
+            <w:proofErr w:type="spellStart"/>
+            <w:r>
+              <w:rPr>
+                <w:rFonts w:cs="Arial"/>
+              </w:rPr>
+              <w:t>then</w:t>
+            </w:r>
+            <w:proofErr w:type="spellEnd"/>
+            <w:r>
+              <w:rPr>
+                <w:rFonts w:cs="Arial"/>
+              </w:rPr>
+              <w:t xml:space="preserve"> </w:t>
+            </w:r>
+            <w:proofErr w:type="spellStart"/>
+            <w:r>
+              <w:rPr>
+                <w:rFonts w:cs="Arial"/>
+              </w:rPr>
+              <w:t>take</w:t>
+            </w:r>
+            <w:proofErr w:type="spellEnd"/>
+            <w:r>
+              <w:rPr>
+                <w:rFonts w:cs="Arial"/>
+              </w:rPr>
+              <w:t xml:space="preserve"> </w:t>
+            </w:r>
+            <w:proofErr w:type="spellStart"/>
+            <w:r>
+              <w:rPr>
+                <w:rFonts w:cs="Arial"/>
+              </w:rPr>
+              <w:t>these</w:t>
+            </w:r>
+            <w:proofErr w:type="spellEnd"/>
+            <w:r>
+              <w:rPr>
+                <w:rFonts w:cs="Arial"/>
+              </w:rPr>
+              <w:t xml:space="preserve"> </w:t>
+            </w:r>
+            <w:proofErr w:type="spellStart"/>
+            <w:r>
+              <w:rPr>
+                <w:rFonts w:cs="Arial"/>
+              </w:rPr>
+              <w:t>findings</w:t>
+            </w:r>
+            <w:proofErr w:type="spellEnd"/>
+            <w:r>
+              <w:rPr>
+                <w:rFonts w:cs="Arial"/>
+              </w:rPr>
+              <w:t xml:space="preserve"> and </w:t>
+            </w:r>
+            <w:proofErr w:type="spellStart"/>
+            <w:r>
+              <w:rPr>
+                <w:rFonts w:cs="Arial"/>
+              </w:rPr>
+              <w:t>articulate</w:t>
+            </w:r>
+            <w:proofErr w:type="spellEnd"/>
+            <w:r>
+              <w:rPr>
+                <w:rFonts w:cs="Arial"/>
+              </w:rPr>
+              <w:t xml:space="preserve"> </w:t>
+            </w:r>
+            <w:proofErr w:type="spellStart"/>
+            <w:r>
+              <w:rPr>
+                <w:rFonts w:cs="Arial"/>
+              </w:rPr>
+              <w:t>them</w:t>
+            </w:r>
+            <w:proofErr w:type="spellEnd"/>
+            <w:r>
+              <w:rPr>
+                <w:rFonts w:cs="Arial"/>
+              </w:rPr>
+              <w:t xml:space="preserve"> in a </w:t>
+            </w:r>
+            <w:proofErr w:type="spellStart"/>
+            <w:r>
+              <w:rPr>
+                <w:rFonts w:cs="Arial"/>
+              </w:rPr>
+              <w:t>manner</w:t>
+            </w:r>
+            <w:proofErr w:type="spellEnd"/>
+            <w:r>
+              <w:rPr>
+                <w:rFonts w:cs="Arial"/>
+              </w:rPr>
+              <w:t xml:space="preserve"> </w:t>
+            </w:r>
+            <w:proofErr w:type="spellStart"/>
+            <w:r>
+              <w:rPr>
+                <w:rFonts w:cs="Arial"/>
+              </w:rPr>
+              <w:t>that</w:t>
+            </w:r>
+            <w:proofErr w:type="spellEnd"/>
+            <w:r>
+              <w:rPr>
+                <w:rFonts w:cs="Arial"/>
+              </w:rPr>
+              <w:t xml:space="preserve"> </w:t>
+            </w:r>
+            <w:proofErr w:type="spellStart"/>
+            <w:r>
+              <w:rPr>
+                <w:rFonts w:cs="Arial"/>
+              </w:rPr>
+              <w:t>executives</w:t>
+            </w:r>
+            <w:proofErr w:type="spellEnd"/>
+            <w:r>
+              <w:rPr>
+                <w:rFonts w:cs="Arial"/>
+              </w:rPr>
+              <w:t xml:space="preserve"> and non-</w:t>
+            </w:r>
+            <w:proofErr w:type="spellStart"/>
+            <w:r>
+              <w:rPr>
+                <w:rFonts w:cs="Arial"/>
+              </w:rPr>
+              <w:t>technical</w:t>
+            </w:r>
+            <w:proofErr w:type="spellEnd"/>
+            <w:r>
+              <w:rPr>
+                <w:rFonts w:cs="Arial"/>
+              </w:rPr>
+              <w:t xml:space="preserve"> </w:t>
+            </w:r>
+            <w:proofErr w:type="spellStart"/>
+            <w:r>
+              <w:rPr>
+                <w:rFonts w:cs="Arial"/>
+              </w:rPr>
+              <w:t>people</w:t>
+            </w:r>
+            <w:proofErr w:type="spellEnd"/>
+            <w:r>
+              <w:rPr>
+                <w:rFonts w:cs="Arial"/>
+              </w:rPr>
+              <w:t xml:space="preserve"> </w:t>
+            </w:r>
+            <w:proofErr w:type="spellStart"/>
+            <w:r>
+              <w:rPr>
+                <w:rFonts w:cs="Arial"/>
+              </w:rPr>
+              <w:t>can</w:t>
+            </w:r>
+            <w:proofErr w:type="spellEnd"/>
+            <w:r>
+              <w:rPr>
+                <w:rFonts w:cs="Arial"/>
+              </w:rPr>
+              <w:t xml:space="preserve"> </w:t>
+            </w:r>
+            <w:proofErr w:type="spellStart"/>
+            <w:r>
+              <w:rPr>
+                <w:rFonts w:cs="Arial"/>
+              </w:rPr>
+              <w:t>understand</w:t>
+            </w:r>
+            <w:proofErr w:type="spellEnd"/>
+            <w:r>
+              <w:rPr>
+                <w:rFonts w:cs="Arial"/>
+              </w:rPr>
+              <w:t>.</w:t>
             </w:r>
           </w:p>
           <w:p>
@@ -1158,7 +1886,23 @@
                 <w:rFonts w:cs="Arial"/>
                 <w:lang w:val="en-US"/>
               </w:rPr>
-              <w:t xml:space="preserve">After completing this module the students will have: </w:t>
+              <w:t xml:space="preserve">After completing this </w:t>
+            </w:r>
+            <w:proofErr w:type="gramStart"/>
+            <w:r>
+              <w:rPr>
+                <w:rFonts w:cs="Arial"/>
+                <w:lang w:val="en-US"/>
+              </w:rPr>
+              <w:t>module</w:t>
+            </w:r>
+            <w:proofErr w:type="gramEnd"/>
+            <w:r>
+              <w:rPr>
+                <w:rFonts w:cs="Arial"/>
+                <w:lang w:val="en-US"/>
+              </w:rPr>
+              <w:t xml:space="preserve"> the students will have: </w:t>
             </w:r>
           </w:p>
           <w:p>
@@ -1247,7 +1991,39 @@
                 <w:rFonts w:cs="Arial"/>
                 <w:lang w:val="en-US"/>
               </w:rPr>
-              <w:t>Work with APIs using packages like `httr` and `jsonlite` in a modeling workflow</w:t>
+              <w:t>Work with APIs using packages like `</w:t>
+            </w:r>
+            <w:proofErr w:type="spellStart"/>
+            <w:r>
+              <w:rPr>
+                <w:rFonts w:cs="Arial"/>
+                <w:lang w:val="en-US"/>
+              </w:rPr>
+              <w:t>httr</w:t>
+            </w:r>
+            <w:proofErr w:type="spellEnd"/>
+            <w:r>
+              <w:rPr>
+                <w:rFonts w:cs="Arial"/>
+                <w:lang w:val="en-US"/>
+              </w:rPr>
+              <w:t>` and `</w:t>
+            </w:r>
+            <w:proofErr w:type="spellStart"/>
+            <w:r>
+              <w:rPr>
+                <w:rFonts w:cs="Arial"/>
+                <w:lang w:val="en-US"/>
+              </w:rPr>
+              <w:t>jsonlite</w:t>
+            </w:r>
+            <w:proofErr w:type="spellEnd"/>
+            <w:r>
+              <w:rPr>
+                <w:rFonts w:cs="Arial"/>
+                <w:lang w:val="en-US"/>
+              </w:rPr>
+              <w:t>` in a modeling workflow</w:t>
             </w:r>
           </w:p>
           <w:p>
@@ -1330,7 +2106,23 @@
                 <w:rFonts w:cs="Arial"/>
                 <w:lang w:val="en-US"/>
               </w:rPr>
-              <w:t xml:space="preserve">After completing this module the students will have the skills: </w:t>
+              <w:t xml:space="preserve">After completing this </w:t>
+            </w:r>
+            <w:proofErr w:type="gramStart"/>
+            <w:r>
+              <w:rPr>
+                <w:rFonts w:cs="Arial"/>
+                <w:lang w:val="en-US"/>
+              </w:rPr>
+              <w:t>module</w:t>
+            </w:r>
+            <w:proofErr w:type="gramEnd"/>
+            <w:r>
+              <w:rPr>
+                <w:rFonts w:cs="Arial"/>
+                <w:lang w:val="en-US"/>
+              </w:rPr>
+              <w:t xml:space="preserve"> the students will have the skills: </w:t>
             </w:r>
           </w:p>
           <w:p>
@@ -1346,12 +2138,126 @@
                 <w:lang w:val="en-US"/>
               </w:rPr>
             </w:pPr>
-            <w:r>
-              <w:rPr>
-                <w:rFonts w:cs="Arial"/>
-              </w:rPr>
-              <w:t>To apply machine learning algorithms to complex business problems</w:t>
-            </w:r>
+            <w:proofErr w:type="spellStart"/>
+            <w:r>
+              <w:rPr>
+                <w:rFonts w:cs="Arial"/>
+              </w:rPr>
+              <w:t>To</w:t>
+            </w:r>
+            <w:proofErr w:type="spellEnd"/>
+            <w:r>
+              <w:rPr>
+                <w:rFonts w:cs="Arial"/>
+              </w:rPr>
+              <w:t xml:space="preserve"> </w:t>
+            </w:r>
+            <w:proofErr w:type="spellStart"/>
+            <w:r>
+              <w:rPr>
+                <w:rFonts w:cs="Arial"/>
+              </w:rPr>
+              <w:t>apply</w:t>
+            </w:r>
+            <w:proofErr w:type="spellEnd"/>
+            <w:r>
+              <w:rPr>
+                <w:rFonts w:cs="Arial"/>
+              </w:rPr>
+              <w:t xml:space="preserve"> </w:t>
+            </w:r>
+            <w:proofErr w:type="spellStart"/>
+            <w:r>
+              <w:rPr>
+                <w:rFonts w:cs="Arial"/>
+              </w:rPr>
+              <w:t>machine</w:t>
+            </w:r>
+            <w:proofErr w:type="spellEnd"/>
+            <w:r>
+              <w:rPr>
+                <w:rFonts w:cs="Arial"/>
+              </w:rPr>
+              <w:t xml:space="preserve"> </w:t>
+            </w:r>
+            <w:proofErr w:type="spellStart"/>
+            <w:r>
+              <w:rPr>
+                <w:rFonts w:cs="Arial"/>
+              </w:rPr>
+              <w:t>learning</w:t>
+            </w:r>
+            <w:proofErr w:type="spellEnd"/>
+            <w:r>
+              <w:rPr>
+                <w:rFonts w:cs="Arial"/>
+              </w:rPr>
+              <w:t xml:space="preserve"> </w:t>
+            </w:r>
+            <w:proofErr w:type="spellStart"/>
+            <w:r>
+              <w:rPr>
+                <w:rFonts w:cs="Arial"/>
+              </w:rPr>
+              <w:t>algorithms</w:t>
+            </w:r>
+            <w:proofErr w:type="spellEnd"/>
+            <w:r>
+              <w:rPr>
+                <w:rFonts w:cs="Arial"/>
+              </w:rPr>
+              <w:t xml:space="preserve"> </w:t>
+            </w:r>
+            <w:proofErr w:type="spellStart"/>
+            <w:r>
+              <w:rPr>
+                <w:rFonts w:cs="Arial"/>
+              </w:rPr>
+              <w:t>to</w:t>
+            </w:r>
+            <w:proofErr w:type="spellEnd"/>
+            <w:r>
+              <w:rPr>
+                <w:rFonts w:cs="Arial"/>
+              </w:rPr>
+              <w:t xml:space="preserve"> </w:t>
+            </w:r>
+            <w:proofErr w:type="spellStart"/>
+            <w:r>
+              <w:rPr>
+                <w:rFonts w:cs="Arial"/>
+              </w:rPr>
+              <w:t>complex</w:t>
+            </w:r>
+            <w:proofErr w:type="spellEnd"/>
+            <w:r>
+              <w:rPr>
+                <w:rFonts w:cs="Arial"/>
+              </w:rPr>
+              <w:t xml:space="preserve"> </w:t>
+            </w:r>
+            <w:proofErr w:type="spellStart"/>
+            <w:r>
+              <w:rPr>
+                <w:rFonts w:cs="Arial"/>
+              </w:rPr>
+              <w:t>business</w:t>
+            </w:r>
+            <w:proofErr w:type="spellEnd"/>
+            <w:r>
+              <w:rPr>
+                <w:rFonts w:cs="Arial"/>
+              </w:rPr>
+              <w:t xml:space="preserve"> </w:t>
+            </w:r>
+            <w:proofErr w:type="spellStart"/>
+            <w:r>
+              <w:rPr>
+                <w:rFonts w:cs="Arial"/>
+              </w:rPr>
+              <w:t>problems</w:t>
+            </w:r>
+            <w:proofErr w:type="spellEnd"/>
           </w:p>
           <w:p>
             <w:pPr>
@@ -1445,7 +2351,23 @@
                 <w:rFonts w:cs="Arial"/>
                 <w:lang w:val="en-US"/>
               </w:rPr>
-              <w:t xml:space="preserve">After completing this module the students will: </w:t>
+              <w:t xml:space="preserve">After completing this </w:t>
+            </w:r>
+            <w:proofErr w:type="gramStart"/>
+            <w:r>
+              <w:rPr>
+                <w:rFonts w:cs="Arial"/>
+                <w:lang w:val="en-US"/>
+              </w:rPr>
+              <w:t>module</w:t>
+            </w:r>
+            <w:proofErr w:type="gramEnd"/>
+            <w:r>
+              <w:rPr>
+                <w:rFonts w:cs="Arial"/>
+                <w:lang w:val="en-US"/>
+              </w:rPr>
+              <w:t xml:space="preserve"> the students will: </w:t>
             </w:r>
           </w:p>
           <w:p>
@@ -1465,7 +2387,91 @@
               <w:rPr>
                 <w:rFonts w:cs="Arial"/>
               </w:rPr>
-              <w:t xml:space="preserve">Frame complex analytical projects for business impact </w:t>
+              <w:t xml:space="preserve">Frame </w:t>
+            </w:r>
+            <w:proofErr w:type="spellStart"/>
+            <w:r>
+              <w:rPr>
+                <w:rFonts w:cs="Arial"/>
+              </w:rPr>
+              <w:t>complex</w:t>
+            </w:r>
+            <w:proofErr w:type="spellEnd"/>
+            <w:r>
+              <w:rPr>
+                <w:rFonts w:cs="Arial"/>
+              </w:rPr>
+              <w:t xml:space="preserve"> </w:t>
+            </w:r>
+            <w:proofErr w:type="spellStart"/>
+            <w:r>
+              <w:rPr>
+                <w:rFonts w:cs="Arial"/>
+              </w:rPr>
+              <w:t>analytical</w:t>
+            </w:r>
+            <w:proofErr w:type="spellEnd"/>
+            <w:r>
+              <w:rPr>
+                <w:rFonts w:cs="Arial"/>
+              </w:rPr>
+              <w:t xml:space="preserve"> </w:t>
+            </w:r>
+            <w:proofErr w:type="spellStart"/>
+            <w:r>
+              <w:rPr>
+                <w:rFonts w:cs="Arial"/>
+              </w:rPr>
+              <w:t>projects</w:t>
+            </w:r>
+            <w:proofErr w:type="spellEnd"/>
+            <w:r>
+              <w:rPr>
+                <w:rFonts w:cs="Arial"/>
+              </w:rPr>
+              <w:t xml:space="preserve"> </w:t>
+            </w:r>
+            <w:proofErr w:type="spellStart"/>
+            <w:r>
+              <w:rPr>
+                <w:rFonts w:cs="Arial"/>
+              </w:rPr>
+              <w:t>for</w:t>
+            </w:r>
+            <w:proofErr w:type="spellEnd"/>
+            <w:r>
+              <w:rPr>
+                <w:rFonts w:cs="Arial"/>
+              </w:rPr>
+              <w:t xml:space="preserve"> </w:t>
+            </w:r>
+            <w:proofErr w:type="spellStart"/>
+            <w:r>
+              <w:rPr>
+                <w:rFonts w:cs="Arial"/>
+              </w:rPr>
+              <w:t>business</w:t>
+            </w:r>
+            <w:proofErr w:type="spellEnd"/>
+            <w:r>
+              <w:rPr>
+                <w:rFonts w:cs="Arial"/>
+              </w:rPr>
+              <w:t xml:space="preserve"> </w:t>
+            </w:r>
+            <w:proofErr w:type="spellStart"/>
+            <w:r>
+              <w:rPr>
+                <w:rFonts w:cs="Arial"/>
+              </w:rPr>
+              <w:t>impact</w:t>
+            </w:r>
+            <w:proofErr w:type="spellEnd"/>
+            <w:r>
+              <w:rPr>
+                <w:rFonts w:cs="Arial"/>
+              </w:rPr>
+              <w:t xml:space="preserve"> </w:t>
             </w:r>
           </w:p>
           <w:p>
@@ -1485,8 +2491,86 @@
               <w:rPr>
                 <w:rFonts w:cs="Arial"/>
               </w:rPr>
-              <w:t>Customize R functions to meet specific business needs</w:t>
-            </w:r>
+              <w:t xml:space="preserve">Customize R </w:t>
+            </w:r>
+            <w:proofErr w:type="spellStart"/>
+            <w:r>
+              <w:rPr>
+                <w:rFonts w:cs="Arial"/>
+              </w:rPr>
+              <w:t>functions</w:t>
+            </w:r>
+            <w:proofErr w:type="spellEnd"/>
+            <w:r>
+              <w:rPr>
+                <w:rFonts w:cs="Arial"/>
+              </w:rPr>
+              <w:t xml:space="preserve"> </w:t>
+            </w:r>
+            <w:proofErr w:type="spellStart"/>
+            <w:r>
+              <w:rPr>
+                <w:rFonts w:cs="Arial"/>
+              </w:rPr>
+              <w:t>to</w:t>
+            </w:r>
+            <w:proofErr w:type="spellEnd"/>
+            <w:r>
+              <w:rPr>
+                <w:rFonts w:cs="Arial"/>
+              </w:rPr>
+              <w:t xml:space="preserve"> </w:t>
+            </w:r>
+            <w:proofErr w:type="spellStart"/>
+            <w:r>
+              <w:rPr>
+                <w:rFonts w:cs="Arial"/>
+              </w:rPr>
+              <w:t>meet</w:t>
+            </w:r>
+            <w:proofErr w:type="spellEnd"/>
+            <w:r>
+              <w:rPr>
+                <w:rFonts w:cs="Arial"/>
+              </w:rPr>
+              <w:t xml:space="preserve"> </w:t>
+            </w:r>
+            <w:proofErr w:type="spellStart"/>
+            <w:r>
+              <w:rPr>
+                <w:rFonts w:cs="Arial"/>
+              </w:rPr>
+              <w:t>specific</w:t>
+            </w:r>
+            <w:proofErr w:type="spellEnd"/>
+            <w:r>
+              <w:rPr>
+                <w:rFonts w:cs="Arial"/>
+              </w:rPr>
+              <w:t xml:space="preserve"> </w:t>
+            </w:r>
+            <w:proofErr w:type="spellStart"/>
+            <w:r>
+              <w:rPr>
+                <w:rFonts w:cs="Arial"/>
+              </w:rPr>
+              <w:t>business</w:t>
+            </w:r>
+            <w:proofErr w:type="spellEnd"/>
+            <w:r>
+              <w:rPr>
+                <w:rFonts w:cs="Arial"/>
+              </w:rPr>
+              <w:t xml:space="preserve"> </w:t>
+            </w:r>
+            <w:proofErr w:type="spellStart"/>
+            <w:r>
+              <w:rPr>
+                <w:rFonts w:cs="Arial"/>
+              </w:rPr>
+              <w:t>needs</w:t>
+            </w:r>
+            <w:proofErr w:type="spellEnd"/>
           </w:p>
           <w:p>
             <w:pPr>
@@ -1501,11 +2585,75 @@
                 <w:lang w:val="en-US"/>
               </w:rPr>
             </w:pPr>
-            <w:r>
-              <w:rPr>
-                <w:rFonts w:cs="Arial"/>
-              </w:rPr>
-              <w:t>Integrate R with other tools and technologies (e.g. APIs)</w:t>
+            <w:proofErr w:type="spellStart"/>
+            <w:r>
+              <w:rPr>
+                <w:rFonts w:cs="Arial"/>
+              </w:rPr>
+              <w:t>Integrate</w:t>
+            </w:r>
+            <w:proofErr w:type="spellEnd"/>
+            <w:r>
+              <w:rPr>
+                <w:rFonts w:cs="Arial"/>
+              </w:rPr>
+              <w:t xml:space="preserve"> R </w:t>
+            </w:r>
+            <w:proofErr w:type="spellStart"/>
+            <w:r>
+              <w:rPr>
+                <w:rFonts w:cs="Arial"/>
+              </w:rPr>
+              <w:t>with</w:t>
+            </w:r>
+            <w:proofErr w:type="spellEnd"/>
+            <w:r>
+              <w:rPr>
+                <w:rFonts w:cs="Arial"/>
+              </w:rPr>
+              <w:t xml:space="preserve"> </w:t>
+            </w:r>
+            <w:proofErr w:type="spellStart"/>
+            <w:r>
+              <w:rPr>
+                <w:rFonts w:cs="Arial"/>
+              </w:rPr>
+              <w:t>other</w:t>
+            </w:r>
+            <w:proofErr w:type="spellEnd"/>
+            <w:r>
+              <w:rPr>
+                <w:rFonts w:cs="Arial"/>
+              </w:rPr>
+              <w:t xml:space="preserve"> </w:t>
+            </w:r>
+            <w:proofErr w:type="spellStart"/>
+            <w:r>
+              <w:rPr>
+                <w:rFonts w:cs="Arial"/>
+              </w:rPr>
+              <w:t>tools</w:t>
+            </w:r>
+            <w:proofErr w:type="spellEnd"/>
+            <w:r>
+              <w:rPr>
+                <w:rFonts w:cs="Arial"/>
+              </w:rPr>
+              <w:t xml:space="preserve"> and </w:t>
+            </w:r>
+            <w:proofErr w:type="spellStart"/>
+            <w:r>
+              <w:rPr>
+                <w:rFonts w:cs="Arial"/>
+              </w:rPr>
+              <w:t>technologies</w:t>
+            </w:r>
+            <w:proofErr w:type="spellEnd"/>
+            <w:r>
+              <w:rPr>
+                <w:rFonts w:cs="Arial"/>
+              </w:rPr>
+              <w:t xml:space="preserve"> (e.g. APIs)</w:t>
             </w:r>
           </w:p>
           <w:p>
@@ -1521,30 +2669,56 @@
                 <w:lang w:val="en-US"/>
               </w:rPr>
             </w:pPr>
-            <w:r>
-              <w:rPr>
-                <w:rFonts w:cs="Arial"/>
-              </w:rPr>
-              <w:t xml:space="preserve">Apply </w:t>
-            </w:r>
-            <w:r>
-              <w:rPr>
-                <w:rFonts w:cs="Arial"/>
-              </w:rPr>
-              <w:t xml:space="preserve">more </w:t>
-            </w:r>
-            <w:r>
-              <w:rPr>
-                <w:rFonts w:cs="Arial"/>
-              </w:rPr>
-              <w:t xml:space="preserve">advanced </w:t>
-            </w:r>
+            <w:proofErr w:type="spellStart"/>
+            <w:r>
+              <w:rPr>
+                <w:rFonts w:cs="Arial"/>
+              </w:rPr>
+              <w:t>Apply</w:t>
+            </w:r>
+            <w:proofErr w:type="spellEnd"/>
+            <w:r>
+              <w:rPr>
+                <w:rFonts w:cs="Arial"/>
+              </w:rPr>
+              <w:t xml:space="preserve"> </w:t>
+            </w:r>
+            <w:proofErr w:type="spellStart"/>
+            <w:r>
+              <w:rPr>
+                <w:rFonts w:cs="Arial"/>
+              </w:rPr>
+              <w:t>more</w:t>
+            </w:r>
+            <w:proofErr w:type="spellEnd"/>
+            <w:r>
+              <w:rPr>
+                <w:rFonts w:cs="Arial"/>
+              </w:rPr>
+              <w:t xml:space="preserve"> </w:t>
+            </w:r>
+            <w:proofErr w:type="spellStart"/>
+            <w:r>
+              <w:rPr>
+                <w:rFonts w:cs="Arial"/>
+              </w:rPr>
+              <w:t>advanced</w:t>
+            </w:r>
+            <w:proofErr w:type="spellEnd"/>
+            <w:r>
+              <w:rPr>
+                <w:rFonts w:cs="Arial"/>
+              </w:rPr>
+              <w:t xml:space="preserve"> </w:t>
+            </w:r>
+            <w:proofErr w:type="spellStart"/>
             <w:r>
               <w:rPr>
                 <w:rFonts w:cs="Arial"/>
               </w:rPr>
               <w:t>algorithms</w:t>
             </w:r>
+            <w:proofErr w:type="spellEnd"/>
             <w:r>
               <w:rPr>
                 <w:rFonts w:cs="Arial"/>
@@ -1555,7 +2729,91 @@
               <w:rPr>
                 <w:rFonts w:cs="Arial"/>
               </w:rPr>
-              <w:t xml:space="preserve">on business data to improve insights and accuracy </w:t>
+              <w:t xml:space="preserve">on </w:t>
+            </w:r>
+            <w:proofErr w:type="spellStart"/>
+            <w:r>
+              <w:rPr>
+                <w:rFonts w:cs="Arial"/>
+              </w:rPr>
+              <w:t>business</w:t>
+            </w:r>
+            <w:proofErr w:type="spellEnd"/>
+            <w:r>
+              <w:rPr>
+                <w:rFonts w:cs="Arial"/>
+              </w:rPr>
+              <w:t xml:space="preserve"> </w:t>
+            </w:r>
+            <w:proofErr w:type="spellStart"/>
+            <w:r>
+              <w:rPr>
+                <w:rFonts w:cs="Arial"/>
+              </w:rPr>
+              <w:t>data</w:t>
+            </w:r>
+            <w:proofErr w:type="spellEnd"/>
+            <w:r>
+              <w:rPr>
+                <w:rFonts w:cs="Arial"/>
+              </w:rPr>
+              <w:t xml:space="preserve"> </w:t>
+            </w:r>
+            <w:proofErr w:type="spellStart"/>
+            <w:r>
+              <w:rPr>
+                <w:rFonts w:cs="Arial"/>
+              </w:rPr>
+              <w:t>to</w:t>
+            </w:r>
+            <w:proofErr w:type="spellEnd"/>
+            <w:r>
+              <w:rPr>
+                <w:rFonts w:cs="Arial"/>
+              </w:rPr>
+              <w:t xml:space="preserve"> </w:t>
+            </w:r>
+            <w:proofErr w:type="spellStart"/>
+            <w:r>
+              <w:rPr>
+                <w:rFonts w:cs="Arial"/>
+              </w:rPr>
+              <w:t>improve</w:t>
+            </w:r>
+            <w:proofErr w:type="spellEnd"/>
+            <w:r>
+              <w:rPr>
+                <w:rFonts w:cs="Arial"/>
+              </w:rPr>
+              <w:t xml:space="preserve"> </w:t>
+            </w:r>
+            <w:proofErr w:type="spellStart"/>
+            <w:r>
+              <w:rPr>
+                <w:rFonts w:cs="Arial"/>
+              </w:rPr>
+              <w:t>insights</w:t>
+            </w:r>
+            <w:proofErr w:type="spellEnd"/>
+            <w:r>
+              <w:rPr>
+                <w:rFonts w:cs="Arial"/>
+              </w:rPr>
+              <w:t xml:space="preserve"> and </w:t>
+            </w:r>
+            <w:proofErr w:type="spellStart"/>
+            <w:r>
+              <w:rPr>
+                <w:rFonts w:cs="Arial"/>
+              </w:rPr>
+              <w:t>accuracy</w:t>
+            </w:r>
+            <w:proofErr w:type="spellEnd"/>
+            <w:r>
+              <w:rPr>
+                <w:rFonts w:cs="Arial"/>
+              </w:rPr>
+              <w:t xml:space="preserve"> </w:t>
             </w:r>
           </w:p>
         </w:tc>
@@ -2785,23 +4043,7 @@
                   <w:rFonts w:cs="Arial"/>
                   <w:lang w:val="en-US"/>
                 </w:rPr>
-                <w:t>https://pkgs.rstudio.com/f</w:t>
-              </w:r>
-              <w:r>
-                <w:rPr>
-                  <w:rStyle w:val="Hyperlink"/>
-                  <w:rFonts w:cs="Arial"/>
-                  <w:lang w:val="en-US"/>
-                </w:rPr>
-                <w:t>l</w:t>
-              </w:r>
-              <w:r>
-                <w:rPr>
-                  <w:rStyle w:val="Hyperlink"/>
-                  <w:rFonts w:cs="Arial"/>
-                  <w:lang w:val="en-US"/>
-                </w:rPr>
-                <w:t>exdashboard/</w:t>
+                <w:t>https://pkgs.rstudio.com/flexdashboard/</w:t>
               </w:r>
             </w:hyperlink>
           </w:p>
@@ -2964,12 +4206,31 @@
               </w:rPr>
               <w:t>`</w:t>
             </w:r>
+            <w:proofErr w:type="spellStart"/>
+            <w:proofErr w:type="gramStart"/>
             <w:r>
               <w:rPr>
                 <w:rFonts w:ascii="Consolas" w:hAnsi="Consolas" w:cs="Consolas"/>
                 <w:lang w:val="en-US"/>
               </w:rPr>
-              <w:t>install.packages(“ggplot2”)</w:t>
+              <w:t>install.packages</w:t>
+            </w:r>
+            <w:proofErr w:type="spellEnd"/>
+            <w:proofErr w:type="gramEnd"/>
+            <w:r>
+              <w:rPr>
+                <w:rFonts w:ascii="Consolas" w:hAnsi="Consolas" w:cs="Consolas"/>
+                <w:lang w:val="en-US"/>
+              </w:rPr>
+              <w:t>(“ggplot2</w:t>
+            </w:r>
+            <w:proofErr w:type="gramStart"/>
+            <w:r>
+              <w:rPr>
+                <w:rFonts w:ascii="Consolas" w:hAnsi="Consolas" w:cs="Consolas"/>
+                <w:lang w:val="en-US"/>
+              </w:rPr>
+              <w:t>”)</w:t>
             </w:r>
             <w:r>
               <w:rPr>
@@ -2978,6 +4239,7 @@
               </w:rPr>
               <w:t>`</w:t>
             </w:r>
+            <w:proofErr w:type="gramEnd"/>
           </w:p>
           <w:p>
             <w:pPr>
@@ -2997,7 +4259,39 @@
                 <w:rFonts w:cs="Arial"/>
                 <w:lang w:val="en-US"/>
               </w:rPr>
-              <w:t>Use the above function to install `ggthemes`, `dplyr`, `caret`</w:t>
+              <w:t>Use the above function to install `</w:t>
+            </w:r>
+            <w:proofErr w:type="spellStart"/>
+            <w:r>
+              <w:rPr>
+                <w:rFonts w:cs="Arial"/>
+                <w:lang w:val="en-US"/>
+              </w:rPr>
+              <w:t>ggthemes</w:t>
+            </w:r>
+            <w:proofErr w:type="spellEnd"/>
+            <w:r>
+              <w:rPr>
+                <w:rFonts w:cs="Arial"/>
+                <w:lang w:val="en-US"/>
+              </w:rPr>
+              <w:t>`, `</w:t>
+            </w:r>
+            <w:proofErr w:type="spellStart"/>
+            <w:r>
+              <w:rPr>
+                <w:rFonts w:cs="Arial"/>
+                <w:lang w:val="en-US"/>
+              </w:rPr>
+              <w:t>dplyr</w:t>
+            </w:r>
+            <w:proofErr w:type="spellEnd"/>
+            <w:r>
+              <w:rPr>
+                <w:rFonts w:cs="Arial"/>
+                <w:lang w:val="en-US"/>
+              </w:rPr>
+              <w:t>`, `caret`</w:t>
             </w:r>
           </w:p>
           <w:p>
@@ -3027,23 +4321,7 @@
                   <w:rFonts w:cs="Arial"/>
                   <w:lang w:val="en-US"/>
                 </w:rPr>
-                <w:t>he</w:t>
-              </w:r>
-              <w:r>
-                <w:rPr>
-                  <w:rStyle w:val="Hyperlink"/>
-                  <w:rFonts w:cs="Arial"/>
-                  <w:lang w:val="en-US"/>
-                </w:rPr>
-                <w:t>r</w:t>
-              </w:r>
-              <w:r>
-                <w:rPr>
-                  <w:rStyle w:val="Hyperlink"/>
-                  <w:rFonts w:cs="Arial"/>
-                  <w:lang w:val="en-US"/>
-                </w:rPr>
-                <w:t>e</w:t>
+                <w:t>here</w:t>
               </w:r>
             </w:hyperlink>
             <w:r>
@@ -3088,7 +4366,29 @@
                 <w:bCs/>
                 <w:lang w:val="en-US"/>
               </w:rPr>
-              <w:t>`basic.R`</w:t>
+              <w:t>`</w:t>
+            </w:r>
+            <w:proofErr w:type="spellStart"/>
+            <w:proofErr w:type="gramStart"/>
+            <w:r>
+              <w:rPr>
+                <w:rFonts w:cs="Arial"/>
+                <w:b/>
+                <w:bCs/>
+                <w:lang w:val="en-US"/>
+              </w:rPr>
+              <w:t>basic.R</w:t>
+            </w:r>
+            <w:proofErr w:type="spellEnd"/>
+            <w:proofErr w:type="gramEnd"/>
+            <w:r>
+              <w:rPr>
+                <w:rFonts w:cs="Arial"/>
+                <w:b/>
+                <w:bCs/>
+                <w:lang w:val="en-US"/>
+              </w:rPr>
+              <w:t>`</w:t>
             </w:r>
             <w:r>
               <w:rPr>
@@ -3185,7 +4485,27 @@
                 <w:bCs/>
                 <w:lang w:val="en-US"/>
               </w:rPr>
-              <w:t>`PreAssignment.Rmd`</w:t>
+              <w:t>`</w:t>
+            </w:r>
+            <w:proofErr w:type="spellStart"/>
+            <w:r>
+              <w:rPr>
+                <w:rFonts w:cs="Arial"/>
+                <w:b/>
+                <w:bCs/>
+                <w:lang w:val="en-US"/>
+              </w:rPr>
+              <w:t>PreAssignment.Rmd</w:t>
+            </w:r>
+            <w:proofErr w:type="spellEnd"/>
+            <w:r>
+              <w:rPr>
+                <w:rFonts w:cs="Arial"/>
+                <w:b/>
+                <w:bCs/>
+                <w:lang w:val="en-US"/>
+              </w:rPr>
+              <w:t>`</w:t>
             </w:r>
             <w:r>
               <w:rPr>
@@ -3236,7 +4556,27 @@
                 <w:bCs/>
                 <w:lang w:val="en-US"/>
               </w:rPr>
-              <w:t>`PreAssignment.Rmd`</w:t>
+              <w:t>`</w:t>
+            </w:r>
+            <w:proofErr w:type="spellStart"/>
+            <w:r>
+              <w:rPr>
+                <w:rFonts w:cs="Arial"/>
+                <w:b/>
+                <w:bCs/>
+                <w:lang w:val="en-US"/>
+              </w:rPr>
+              <w:t>PreAssignment.Rmd</w:t>
+            </w:r>
+            <w:proofErr w:type="spellEnd"/>
+            <w:r>
+              <w:rPr>
+                <w:rFonts w:cs="Arial"/>
+                <w:b/>
+                <w:bCs/>
+                <w:lang w:val="en-US"/>
+              </w:rPr>
+              <w:t>`</w:t>
             </w:r>
             <w:r>
               <w:rPr>
@@ -3341,7 +4681,23 @@
                 <w:rFonts w:cs="Arial"/>
                 <w:lang w:val="en-US"/>
               </w:rPr>
-              <w:t>Add a ggplot from the script or another you made while exploring the data</w:t>
+              <w:t xml:space="preserve">Add a </w:t>
+            </w:r>
+            <w:proofErr w:type="spellStart"/>
+            <w:r>
+              <w:rPr>
+                <w:rFonts w:cs="Arial"/>
+                <w:lang w:val="en-US"/>
+              </w:rPr>
+              <w:t>ggplot</w:t>
+            </w:r>
+            <w:proofErr w:type="spellEnd"/>
+            <w:r>
+              <w:rPr>
+                <w:rFonts w:cs="Arial"/>
+                <w:lang w:val="en-US"/>
+              </w:rPr>
+              <w:t xml:space="preserve"> from the script or another you made while exploring the data</w:t>
             </w:r>
           </w:p>
           <w:p>
@@ -3758,7 +5114,39 @@
                 <w:rFonts w:cs="Arial"/>
                 <w:lang w:val="en-US"/>
               </w:rPr>
-              <w:t xml:space="preserve"> metric like RMSE, MAPE, LogLoss, Tweedie Deviance etc based on your understanding of the problem.</w:t>
+              <w:t xml:space="preserve"> metric like RMSE, MAPE, </w:t>
+            </w:r>
+            <w:proofErr w:type="spellStart"/>
+            <w:r>
+              <w:rPr>
+                <w:rFonts w:cs="Arial"/>
+                <w:lang w:val="en-US"/>
+              </w:rPr>
+              <w:t>LogLoss</w:t>
+            </w:r>
+            <w:proofErr w:type="spellEnd"/>
+            <w:r>
+              <w:rPr>
+                <w:rFonts w:cs="Arial"/>
+                <w:lang w:val="en-US"/>
+              </w:rPr>
+              <w:t xml:space="preserve">, Tweedie Deviance </w:t>
+            </w:r>
+            <w:proofErr w:type="spellStart"/>
+            <w:r>
+              <w:rPr>
+                <w:rFonts w:cs="Arial"/>
+                <w:lang w:val="en-US"/>
+              </w:rPr>
+              <w:t>etc</w:t>
+            </w:r>
+            <w:proofErr w:type="spellEnd"/>
+            <w:r>
+              <w:rPr>
+                <w:rFonts w:cs="Arial"/>
+                <w:lang w:val="en-US"/>
+              </w:rPr>
+              <w:t xml:space="preserve"> based on your understanding of the problem.</w:t>
             </w:r>
           </w:p>
           <w:p>
@@ -3853,6 +5241,7 @@
               </w:rPr>
               <w:t>Right side: Create a scatterplot of the Y variable with the most correlated x variable.  Apply the g docs theme from `</w:t>
             </w:r>
+            <w:proofErr w:type="spellStart"/>
             <w:r>
               <w:rPr>
                 <w:rFonts w:ascii="Consolas" w:hAnsi="Consolas" w:cs="Consolas"/>
@@ -3860,6 +5249,7 @@
               </w:rPr>
               <w:t>ggthemes</w:t>
             </w:r>
+            <w:proofErr w:type="spellEnd"/>
             <w:r>
               <w:rPr>
                 <w:rFonts w:ascii="Consolas" w:hAnsi="Consolas" w:cs="Consolas"/>
@@ -4297,23 +5687,7 @@
                   <w:rFonts w:cs="Arial"/>
                   <w:lang w:val="en-US"/>
                 </w:rPr>
-                <w:t>he</w:t>
-              </w:r>
-              <w:r>
-                <w:rPr>
-                  <w:rStyle w:val="Hyperlink"/>
-                  <w:rFonts w:cs="Arial"/>
-                  <w:lang w:val="en-US"/>
-                </w:rPr>
-                <w:t>r</w:t>
-              </w:r>
-              <w:r>
-                <w:rPr>
-                  <w:rStyle w:val="Hyperlink"/>
-                  <w:rFonts w:cs="Arial"/>
-                  <w:lang w:val="en-US"/>
-                </w:rPr>
-                <w:t>e</w:t>
+                <w:t>here</w:t>
               </w:r>
             </w:hyperlink>
             <w:r>
@@ -4605,7 +5979,23 @@
                 <w:rFonts w:cs="Arial"/>
                 <w:lang w:val="en-US"/>
               </w:rPr>
-              <w:t>; contributor to sci-kit learn, previous VP Engineering at DataRobot, currently Principal Research Engineer Ne</w:t>
+              <w:t xml:space="preserve">; contributor to sci-kit learn, previous VP Engineering at </w:t>
+            </w:r>
+            <w:proofErr w:type="spellStart"/>
+            <w:r>
+              <w:rPr>
+                <w:rFonts w:cs="Arial"/>
+                <w:lang w:val="en-US"/>
+              </w:rPr>
+              <w:t>DataRobot</w:t>
+            </w:r>
+            <w:proofErr w:type="spellEnd"/>
+            <w:r>
+              <w:rPr>
+                <w:rFonts w:cs="Arial"/>
+                <w:lang w:val="en-US"/>
+              </w:rPr>
+              <w:t>, currently Principal Research Engineer Ne</w:t>
             </w:r>
             <w:r>
               <w:rPr>
@@ -4619,8 +6009,17 @@
                 <w:rFonts w:cs="Arial"/>
                 <w:lang w:val="en-US"/>
               </w:rPr>
-              <w:t xml:space="preserve"> Cybernetica</w:t>
-            </w:r>
+              <w:t xml:space="preserve"> </w:t>
+            </w:r>
+            <w:proofErr w:type="spellStart"/>
+            <w:r>
+              <w:rPr>
+                <w:rFonts w:cs="Arial"/>
+                <w:lang w:val="en-US"/>
+              </w:rPr>
+              <w:t>Cybernetica</w:t>
+            </w:r>
+            <w:proofErr w:type="spellEnd"/>
           </w:p>
           <w:p>
             <w:pPr>
@@ -5505,6 +6904,7 @@
               </w:rPr>
               <w:t xml:space="preserve"> </w:t>
             </w:r>
+            <w:proofErr w:type="gramStart"/>
             <w:r>
               <w:rPr>
                 <w:lang w:val="en-US"/>
@@ -5516,15 +6916,9 @@
                 <w:rFonts w:cs="Tahoma"/>
                 <w:lang w:val="en-US"/>
               </w:rPr>
-              <w:t xml:space="preserve"> </w:t>
-            </w:r>
-            <w:r>
-              <w:rPr>
-                <w:rFonts w:cs="Tahoma"/>
-                <w:lang w:val="en-US"/>
-              </w:rPr>
-              <w:t>defects_data.csv</w:t>
-            </w:r>
+              <w:t xml:space="preserve"> defects_data.csv</w:t>
+            </w:r>
+            <w:proofErr w:type="gramEnd"/>
             <w:r>
               <w:rPr>
                 <w:rFonts w:ascii="Verdana" w:hAnsi="Verdana" w:cs="Tahoma"/>
@@ -5785,7 +7179,23 @@
                 <w:rFonts w:cs="Tahoma"/>
                 <w:lang w:val="en-US"/>
               </w:rPr>
-              <w:t>Echarts4r, r-markdown, flexdashboard to HTML pages</w:t>
+              <w:t xml:space="preserve">Echarts4r, r-markdown, </w:t>
+            </w:r>
+            <w:proofErr w:type="spellStart"/>
+            <w:r>
+              <w:rPr>
+                <w:rFonts w:cs="Tahoma"/>
+                <w:lang w:val="en-US"/>
+              </w:rPr>
+              <w:t>flexdashboard</w:t>
+            </w:r>
+            <w:proofErr w:type="spellEnd"/>
+            <w:r>
+              <w:rPr>
+                <w:rFonts w:cs="Tahoma"/>
+                <w:lang w:val="en-US"/>
+              </w:rPr>
+              <w:t xml:space="preserve"> to HTML pages</w:t>
             </w:r>
           </w:p>
         </w:tc>
@@ -5928,7 +7338,39 @@
                 <w:rFonts w:cs="Tahoma"/>
                 <w:lang w:val="en-US"/>
               </w:rPr>
-              <w:t xml:space="preserve"> – Model, Assess; time permitting make a flexdashboard of data insights</w:t>
+              <w:t xml:space="preserve"> – Model, </w:t>
+            </w:r>
+            <w:proofErr w:type="gramStart"/>
+            <w:r>
+              <w:rPr>
+                <w:rFonts w:cs="Tahoma"/>
+                <w:lang w:val="en-US"/>
+              </w:rPr>
+              <w:t>Assess</w:t>
+            </w:r>
+            <w:proofErr w:type="gramEnd"/>
+            <w:r>
+              <w:rPr>
+                <w:rFonts w:cs="Tahoma"/>
+                <w:lang w:val="en-US"/>
+              </w:rPr>
+              <w:t xml:space="preserve">; time permitting make a </w:t>
+            </w:r>
+            <w:proofErr w:type="spellStart"/>
+            <w:r>
+              <w:rPr>
+                <w:rFonts w:cs="Tahoma"/>
+                <w:lang w:val="en-US"/>
+              </w:rPr>
+              <w:t>flexdashboard</w:t>
+            </w:r>
+            <w:proofErr w:type="spellEnd"/>
+            <w:r>
+              <w:rPr>
+                <w:rFonts w:cs="Tahoma"/>
+                <w:lang w:val="en-US"/>
+              </w:rPr>
+              <w:t xml:space="preserve"> of data insights</w:t>
             </w:r>
           </w:p>
         </w:tc>
@@ -6041,17 +7483,61 @@
                 <w:lang w:val="en-US"/>
               </w:rPr>
             </w:pPr>
-            <w:r>
-              <w:rPr>
-                <w:lang w:val="en-US"/>
-              </w:rPr>
-              <w:t xml:space="preserve">Hands-on:Challenge </w:t>
-            </w:r>
-            <w:r>
-              <w:rPr>
-                <w:lang w:val="en-US"/>
-              </w:rPr>
-              <w:t>– use JinaAI to webscrape information from adidas, or another website</w:t>
+            <w:proofErr w:type="spellStart"/>
+            <w:r>
+              <w:rPr>
+                <w:lang w:val="en-US"/>
+              </w:rPr>
+              <w:t>Hands-</w:t>
+            </w:r>
+            <w:proofErr w:type="gramStart"/>
+            <w:r>
+              <w:rPr>
+                <w:lang w:val="en-US"/>
+              </w:rPr>
+              <w:t>on:Challenge</w:t>
+            </w:r>
+            <w:proofErr w:type="spellEnd"/>
+            <w:proofErr w:type="gramEnd"/>
+            <w:r>
+              <w:rPr>
+                <w:lang w:val="en-US"/>
+              </w:rPr>
+              <w:t xml:space="preserve"> </w:t>
+            </w:r>
+            <w:r>
+              <w:rPr>
+                <w:lang w:val="en-US"/>
+              </w:rPr>
+              <w:t xml:space="preserve">– use </w:t>
+            </w:r>
+            <w:proofErr w:type="spellStart"/>
+            <w:r>
+              <w:rPr>
+                <w:lang w:val="en-US"/>
+              </w:rPr>
+              <w:t>JinaAI</w:t>
+            </w:r>
+            <w:proofErr w:type="spellEnd"/>
+            <w:r>
+              <w:rPr>
+                <w:lang w:val="en-US"/>
+              </w:rPr>
+              <w:t xml:space="preserve"> to </w:t>
+            </w:r>
+            <w:proofErr w:type="spellStart"/>
+            <w:r>
+              <w:rPr>
+                <w:lang w:val="en-US"/>
+              </w:rPr>
+              <w:t>webscrape</w:t>
+            </w:r>
+            <w:proofErr w:type="spellEnd"/>
+            <w:r>
+              <w:rPr>
+                <w:lang w:val="en-US"/>
+              </w:rPr>
+              <w:t xml:space="preserve"> information from adidas, or another website</w:t>
             </w:r>
             <w:r>
               <w:rPr>
@@ -6368,7 +7854,21 @@
                 <w:rFonts w:cs="Arial"/>
                 <w:lang w:val="en-US"/>
               </w:rPr>
-              <w:t xml:space="preserve"> using this </w:t>
+              <w:t xml:space="preserve"> using </w:t>
+            </w:r>
+            <w:r>
+              <w:rPr>
+                <w:rFonts w:cs="Arial"/>
+                <w:lang w:val="en-US"/>
+              </w:rPr>
+              <w:t>the correct data from the repository here:</w:t>
+            </w:r>
+            <w:r>
+              <w:rPr>
+                <w:rFonts w:cs="Arial"/>
+                <w:lang w:val="en-US"/>
+              </w:rPr>
+              <w:br/>
             </w:r>
             <w:hyperlink r:id="rId26" w:history="1">
               <w:r>
@@ -6377,23 +7877,7 @@
                   <w:rFonts w:cs="Arial"/>
                   <w:lang w:val="en-US"/>
                 </w:rPr>
-                <w:t>fi</w:t>
-              </w:r>
-              <w:r>
-                <w:rPr>
-                  <w:rStyle w:val="Hyperlink"/>
-                  <w:rFonts w:cs="Arial"/>
-                  <w:lang w:val="en-US"/>
-                </w:rPr>
-                <w:t>l</w:t>
-              </w:r>
-              <w:r>
-                <w:rPr>
-                  <w:rStyle w:val="Hyperlink"/>
-                  <w:rFonts w:cs="Arial"/>
-                  <w:lang w:val="en-US"/>
-                </w:rPr>
-                <w:t>e</w:t>
+                <w:t>https://github.com/kwartler/Vienna_25/tree/main/Winter/PostModuleAssignment</w:t>
               </w:r>
             </w:hyperlink>
             <w:r>
@@ -6401,14 +7885,7 @@
                 <w:rFonts w:cs="Arial"/>
                 <w:lang w:val="en-US"/>
               </w:rPr>
-              <w:t xml:space="preserve"> from our class repository.</w:t>
-            </w:r>
-            <w:r>
-              <w:rPr>
-                <w:rFonts w:cs="Arial"/>
-                <w:lang w:val="en-US"/>
-              </w:rPr>
-              <w:t xml:space="preserve"> </w:t>
+              <w:br/>
             </w:r>
             <w:r>
               <w:rPr>
@@ -6450,7 +7927,21 @@
                 <w:rFonts w:cs="Arial"/>
                 <w:lang w:val="en-US"/>
               </w:rPr>
-              <w:t xml:space="preserve">  Turn in your error free R script covering all aspects of the SEMMA (or similar) ML workflow.  </w:t>
+              <w:t xml:space="preserve">  Turn in your error free R script covering all aspects of </w:t>
+            </w:r>
+            <w:r>
+              <w:rPr>
+                <w:rFonts w:cs="Arial"/>
+                <w:lang w:val="en-US"/>
+              </w:rPr>
+              <w:t>a data science workflow</w:t>
+            </w:r>
+            <w:r>
+              <w:rPr>
+                <w:rFonts w:cs="Arial"/>
+                <w:lang w:val="en-US"/>
+              </w:rPr>
+              <w:t xml:space="preserve">.  </w:t>
             </w:r>
             <w:r>
               <w:rPr>
@@ -6488,7 +7979,21 @@
                 <w:rFonts w:cs="Arial"/>
                 <w:lang w:val="en-US"/>
               </w:rPr>
-              <w:t xml:space="preserve"> from this </w:t>
+              <w:t xml:space="preserve"> from </w:t>
+            </w:r>
+            <w:r>
+              <w:rPr>
+                <w:rFonts w:cs="Arial"/>
+                <w:lang w:val="en-US"/>
+              </w:rPr>
+              <w:t>the correct folder in the class repository here:</w:t>
+            </w:r>
+            <w:r>
+              <w:rPr>
+                <w:rFonts w:cs="Arial"/>
+                <w:lang w:val="en-US"/>
+              </w:rPr>
+              <w:br/>
             </w:r>
             <w:hyperlink r:id="rId27" w:history="1">
               <w:r>
@@ -6497,7 +8002,7 @@
                   <w:rFonts w:cs="Arial"/>
                   <w:lang w:val="en-US"/>
                 </w:rPr>
-                <w:t>file</w:t>
+                <w:t>https://github.com/kwartler/Vienna_25/tree/main/Winter/PostModuleAssignment</w:t>
               </w:r>
             </w:hyperlink>
             <w:r>
@@ -6505,14 +8010,23 @@
                 <w:rFonts w:cs="Arial"/>
                 <w:lang w:val="en-US"/>
               </w:rPr>
-              <w:t xml:space="preserve"> which has more NA and outliers than the basic version</w:t>
-            </w:r>
-            <w:r>
-              <w:rPr>
-                <w:rFonts w:cs="Arial"/>
-                <w:lang w:val="en-US"/>
-              </w:rPr>
-              <w:t xml:space="preserve">.  Make predictions on a test </w:t>
+              <w:t xml:space="preserve"> </w:t>
+            </w:r>
+          </w:p>
+          <w:p>
+            <w:pPr>
+              <w:spacing w:before="0" w:after="120"/>
+              <w:rPr>
+                <w:rFonts w:cs="Arial"/>
+                <w:lang w:val="en-US"/>
+              </w:rPr>
+            </w:pPr>
+            <w:r>
+              <w:rPr>
+                <w:rFonts w:cs="Arial"/>
+                <w:lang w:val="en-US"/>
+              </w:rPr>
+              <w:t xml:space="preserve">Make predictions on a test </w:t>
             </w:r>
             <w:r>
               <w:rPr>
@@ -6592,8 +8106,89 @@
                 <w:rFonts w:cs="Arial"/>
                 <w:lang w:val="en-US"/>
               </w:rPr>
-              <w:t xml:space="preserve">The folder of JSON files is here.  </w:t>
-            </w:r>
+              <w:t xml:space="preserve">The folder of JSON files </w:t>
+            </w:r>
+            <w:proofErr w:type="gramStart"/>
+            <w:r>
+              <w:rPr>
+                <w:rFonts w:cs="Arial"/>
+                <w:lang w:val="en-US"/>
+              </w:rPr>
+              <w:t>are</w:t>
+            </w:r>
+            <w:proofErr w:type="gramEnd"/>
+            <w:r>
+              <w:rPr>
+                <w:rFonts w:cs="Arial"/>
+                <w:lang w:val="en-US"/>
+              </w:rPr>
+              <w:t xml:space="preserve"> in the class repository under mastery found here:</w:t>
+            </w:r>
+            <w:r>
+              <w:rPr>
+                <w:rFonts w:cs="Arial"/>
+                <w:lang w:val="en-US"/>
+              </w:rPr>
+              <w:br/>
+            </w:r>
+            <w:hyperlink r:id="rId28" w:history="1">
+              <w:r>
+                <w:rPr>
+                  <w:rStyle w:val="Hyperlink"/>
+                  <w:rFonts w:cs="Arial"/>
+                  <w:lang w:val="en-US"/>
+                </w:rPr>
+                <w:t>https://github.com/kwartler/Vienna_25/tree/main/Winter/PostModuleAssignment</w:t>
+              </w:r>
+            </w:hyperlink>
+          </w:p>
+          <w:p>
+            <w:pPr>
+              <w:spacing w:before="0" w:after="120"/>
+              <w:rPr>
+                <w:rFonts w:cs="Arial"/>
+                <w:lang w:val="en-US"/>
+              </w:rPr>
+            </w:pPr>
+            <w:r>
+              <w:rPr>
+                <w:rFonts w:cs="Arial"/>
+                <w:lang w:val="en-US"/>
+              </w:rPr>
+              <w:t xml:space="preserve">If you have the files locally you can use </w:t>
+            </w:r>
+            <w:proofErr w:type="spellStart"/>
+            <w:r>
+              <w:rPr>
+                <w:rFonts w:cs="Arial"/>
+                <w:lang w:val="en-US"/>
+              </w:rPr>
+              <w:t>list.files</w:t>
+            </w:r>
+            <w:proofErr w:type="spellEnd"/>
+            <w:r>
+              <w:rPr>
+                <w:rFonts w:cs="Arial"/>
+                <w:lang w:val="en-US"/>
+              </w:rPr>
+              <w:t>()</w:t>
+            </w:r>
+            <w:r>
+              <w:rPr>
+                <w:rFonts w:cs="Arial"/>
+                <w:lang w:val="en-US"/>
+              </w:rPr>
+              <w:t xml:space="preserve"> to programmatically.</w:t>
+            </w:r>
+          </w:p>
+          <w:p>
+            <w:pPr>
+              <w:spacing w:before="0" w:after="120"/>
+              <w:rPr>
+                <w:rFonts w:cs="Arial"/>
+                <w:lang w:val="en-US"/>
+              </w:rPr>
+            </w:pPr>
             <w:r>
               <w:rPr>
                 <w:rFonts w:cs="Arial"/>
@@ -6620,7 +8215,23 @@
                 <w:rFonts w:cs="Arial"/>
                 <w:lang w:val="en-US"/>
               </w:rPr>
-              <w:t xml:space="preserve">reate a dashboard of EDA visuals using R-markdown/flexdashboard and “knit” it to HTML. </w:t>
+              <w:t>reate a dashboard of EDA visuals using R-markdown/</w:t>
+            </w:r>
+            <w:proofErr w:type="spellStart"/>
+            <w:r>
+              <w:rPr>
+                <w:rFonts w:cs="Arial"/>
+                <w:lang w:val="en-US"/>
+              </w:rPr>
+              <w:t>flexdashboard</w:t>
+            </w:r>
+            <w:proofErr w:type="spellEnd"/>
+            <w:r>
+              <w:rPr>
+                <w:rFonts w:cs="Arial"/>
+                <w:lang w:val="en-US"/>
+              </w:rPr>
+              <w:t xml:space="preserve"> and “knit” it to HTML. </w:t>
             </w:r>
             <w:r>
               <w:rPr>
@@ -6634,7 +8245,23 @@
                 <w:rFonts w:cs="Arial"/>
                 <w:lang w:val="en-US"/>
               </w:rPr>
-              <w:t xml:space="preserve">rite at least 2 custom functions and use a loop and/or lapply functions to perform the analytical workflow.  Turn in your R script, markdown and HTML. </w:t>
+              <w:t xml:space="preserve">rite at least 2 custom functions and use a loop and/or </w:t>
+            </w:r>
+            <w:proofErr w:type="spellStart"/>
+            <w:r>
+              <w:rPr>
+                <w:rFonts w:cs="Arial"/>
+                <w:lang w:val="en-US"/>
+              </w:rPr>
+              <w:t>lapply</w:t>
+            </w:r>
+            <w:proofErr w:type="spellEnd"/>
+            <w:r>
+              <w:rPr>
+                <w:rFonts w:cs="Arial"/>
+                <w:lang w:val="en-US"/>
+              </w:rPr>
+              <w:t xml:space="preserve"> functions to perform the analytical workflow.  Turn in your R script, markdown and HTML. </w:t>
             </w:r>
           </w:p>
           <w:p>
@@ -6769,6 +8396,7 @@
                 <w:rFonts w:cs="Arial"/>
                 <w:lang w:val="en-US"/>
               </w:rPr>
+              <w:lastRenderedPageBreak/>
               <w:t>Deliverables:</w:t>
             </w:r>
             <w:r>
@@ -6877,7 +8505,6 @@
                 <w:rFonts w:cs="Arial"/>
                 <w:lang w:val="en-US"/>
               </w:rPr>
-              <w:lastRenderedPageBreak/>
               <w:br/>
             </w:r>
             <w:r>
@@ -7642,8 +9269,13 @@
               <w:spacing w:before="240" w:after="240" w:line="276" w:lineRule="auto"/>
               <w:ind w:left="140"/>
             </w:pPr>
-            <w:r>
-              <w:t xml:space="preserve">E-mail: </w:t>
+            <w:proofErr w:type="spellStart"/>
+            <w:r>
+              <w:t>E-mail</w:t>
+            </w:r>
+            <w:proofErr w:type="spellEnd"/>
+            <w:r>
+              <w:t xml:space="preserve">: </w:t>
             </w:r>
             <w:r>
               <w:rPr>
@@ -7769,11 +9401,19 @@
               </w:rPr>
               <w:t xml:space="preserve">Ted Kwartler is a distinguished data science and AI professional with roles in both academia and the corporate sector. He is an Adjunct Lecturer at Harvard University Extension School and Global School in Empirical Research Methods at St. Gallen University. After earning his </w:t>
             </w:r>
-            <w:r>
-              <w:rPr>
-                <w:lang w:val="en-US"/>
-              </w:rPr>
-              <w:t xml:space="preserve">Master’s of </w:t>
+            <w:proofErr w:type="spellStart"/>
+            <w:r>
+              <w:rPr>
+                <w:lang w:val="en-US"/>
+              </w:rPr>
+              <w:t>Master’s</w:t>
+            </w:r>
+            <w:proofErr w:type="spellEnd"/>
+            <w:r>
+              <w:rPr>
+                <w:lang w:val="en-US"/>
+              </w:rPr>
+              <w:t xml:space="preserve"> of </w:t>
             </w:r>
             <w:r>
               <w:rPr>
@@ -7791,7 +9431,21 @@
               <w:rPr>
                 <w:lang w:val="en-US"/>
               </w:rPr>
-              <w:t>AVP of Data Science Innovation at Liberty Mutual Insurance, followed by roles as the VP of Trusted AI and Chief Technology Officer for Generative AI at DataRobot. He's currently the Managing Director at Accenture</w:t>
+              <w:t xml:space="preserve">AVP of Data Science Innovation at Liberty Mutual Insurance, followed by roles as the VP of Trusted AI and Chief Technology Officer for Generative AI at </w:t>
+            </w:r>
+            <w:proofErr w:type="spellStart"/>
+            <w:r>
+              <w:rPr>
+                <w:lang w:val="en-US"/>
+              </w:rPr>
+              <w:t>DataRobot</w:t>
+            </w:r>
+            <w:proofErr w:type="spellEnd"/>
+            <w:r>
+              <w:rPr>
+                <w:lang w:val="en-US"/>
+              </w:rPr>
+              <w:t>. He's currently the Managing Director at Accenture</w:t>
             </w:r>
             <w:r>
               <w:rPr>
@@ -7901,12 +9555,12 @@
       </w:pPr>
     </w:p>
     <w:sectPr>
-      <w:headerReference w:type="even" r:id="rId28"/>
-      <w:headerReference w:type="default" r:id="rId29"/>
-      <w:footerReference w:type="even" r:id="rId30"/>
-      <w:footerReference w:type="default" r:id="rId31"/>
-      <w:headerReference w:type="first" r:id="rId32"/>
-      <w:footerReference w:type="first" r:id="rId33"/>
+      <w:headerReference w:type="even" r:id="rId29"/>
+      <w:headerReference w:type="default" r:id="rId30"/>
+      <w:footerReference w:type="even" r:id="rId31"/>
+      <w:footerReference w:type="default" r:id="rId32"/>
+      <w:headerReference w:type="first" r:id="rId33"/>
+      <w:footerReference w:type="first" r:id="rId34"/>
       <w:type w:val="continuous"/>
       <w:pgSz w:w="11906" w:h="16838" w:code="9"/>
       <w:pgMar w:top="3119" w:right="1758" w:bottom="1701" w:left="1701" w:header="709" w:footer="1418" w:gutter="0"/>

</xml_diff>